<commit_message>
finalised meta-analysis of saprotrophs
</commit_message>
<xml_diff>
--- a/Manuscript/ISME Journal/Manuscript.docx
+++ b/Manuscript/ISME Journal/Manuscript.docx
@@ -272,6 +272,7 @@
           <w:bCs/>
         </w:rPr>
       </w:pPr>
+      <w:proofErr w:type="spellStart"/>
       <w:r>
         <w:rPr>
           <w:rFonts w:ascii="Times New Roman" w:hAnsi="Times New Roman" w:cs="Times New Roman"/>
@@ -280,6 +281,7 @@
         </w:rPr>
         <w:t>ORCiD</w:t>
       </w:r>
+      <w:proofErr w:type="spellEnd"/>
     </w:p>
     <w:p>
       <w:pPr>
@@ -557,7 +559,21 @@
         <w:rPr>
           <w:rFonts w:ascii="Times New Roman" w:hAnsi="Times New Roman" w:cs="Times New Roman"/>
         </w:rPr>
-        <w:t>{Bengtsson and Øvreås, 2010 #102529}</w:t>
+        <w:t xml:space="preserve">{Bengtsson and </w:t>
+      </w:r>
+      <w:proofErr w:type="spellStart"/>
+      <w:r>
+        <w:rPr>
+          <w:rFonts w:ascii="Times New Roman" w:hAnsi="Times New Roman" w:cs="Times New Roman"/>
+        </w:rPr>
+        <w:t>Øvreås</w:t>
+      </w:r>
+      <w:proofErr w:type="spellEnd"/>
+      <w:r>
+        <w:rPr>
+          <w:rFonts w:ascii="Times New Roman" w:hAnsi="Times New Roman" w:cs="Times New Roman"/>
+        </w:rPr>
+        <w:t>, 2010 #102529}</w:t>
       </w:r>
     </w:p>
     <w:p>
@@ -648,19 +664,47 @@
         <w:rPr>
           <w:rFonts w:ascii="Times New Roman" w:hAnsi="Times New Roman" w:cs="Times New Roman"/>
         </w:rPr>
-        <w:t>{Newell, 1981 #12902}</w:t>
-      </w:r>
-      <w:r>
-        <w:rPr>
-          <w:rFonts w:ascii="Times New Roman" w:hAnsi="Times New Roman" w:cs="Times New Roman"/>
-        </w:rPr>
-        <w:t>{Mazure and Field, 1980 #4952}</w:t>
-      </w:r>
-      <w:r>
-        <w:rPr>
-          <w:rFonts w:ascii="Times New Roman" w:hAnsi="Times New Roman" w:cs="Times New Roman"/>
-        </w:rPr>
-        <w:t>{Shiba and Taga, 1980 #78402}</w:t>
+        <w:t>{Newell, 1981 #</w:t>
+      </w:r>
+      <w:proofErr w:type="gramStart"/>
+      <w:r>
+        <w:rPr>
+          <w:rFonts w:ascii="Times New Roman" w:hAnsi="Times New Roman" w:cs="Times New Roman"/>
+        </w:rPr>
+        <w:t>12902}</w:t>
+      </w:r>
+      <w:r>
+        <w:rPr>
+          <w:rFonts w:ascii="Times New Roman" w:hAnsi="Times New Roman" w:cs="Times New Roman"/>
+        </w:rPr>
+        <w:t>{</w:t>
+      </w:r>
+      <w:proofErr w:type="gramEnd"/>
+      <w:r>
+        <w:rPr>
+          <w:rFonts w:ascii="Times New Roman" w:hAnsi="Times New Roman" w:cs="Times New Roman"/>
+        </w:rPr>
+        <w:t>Mazure and Field, 1980 #</w:t>
+      </w:r>
+      <w:proofErr w:type="gramStart"/>
+      <w:r>
+        <w:rPr>
+          <w:rFonts w:ascii="Times New Roman" w:hAnsi="Times New Roman" w:cs="Times New Roman"/>
+        </w:rPr>
+        <w:t>4952}</w:t>
+      </w:r>
+      <w:r>
+        <w:rPr>
+          <w:rFonts w:ascii="Times New Roman" w:hAnsi="Times New Roman" w:cs="Times New Roman"/>
+        </w:rPr>
+        <w:t>{</w:t>
+      </w:r>
+      <w:proofErr w:type="gramEnd"/>
+      <w:r>
+        <w:rPr>
+          <w:rFonts w:ascii="Times New Roman" w:hAnsi="Times New Roman" w:cs="Times New Roman"/>
+        </w:rPr>
+        <w:t>Shiba and Taga, 1980 #78402}</w:t>
       </w:r>
     </w:p>
     <w:p>
@@ -686,20 +730,48 @@
         <w:rPr>
           <w:rFonts w:ascii="Times New Roman" w:hAnsi="Times New Roman" w:cs="Times New Roman"/>
         </w:rPr>
-        <w:t>{de Bettignies et al., 2020 #27484}</w:t>
-      </w:r>
-    </w:p>
-    <w:p>
-      <w:pPr>
-        <w:rPr>
-          <w:rFonts w:ascii="Times New Roman" w:hAnsi="Times New Roman" w:cs="Times New Roman"/>
-        </w:rPr>
-      </w:pPr>
-      <w:r>
-        <w:rPr>
-          <w:rFonts w:ascii="Times New Roman" w:hAnsi="Times New Roman" w:cs="Times New Roman"/>
-        </w:rPr>
-        <w:t>{Marzinelli et al., 2015 #13683}</w:t>
+        <w:t xml:space="preserve">{de </w:t>
+      </w:r>
+      <w:proofErr w:type="spellStart"/>
+      <w:r>
+        <w:rPr>
+          <w:rFonts w:ascii="Times New Roman" w:hAnsi="Times New Roman" w:cs="Times New Roman"/>
+        </w:rPr>
+        <w:t>Bettignies</w:t>
+      </w:r>
+      <w:proofErr w:type="spellEnd"/>
+      <w:r>
+        <w:rPr>
+          <w:rFonts w:ascii="Times New Roman" w:hAnsi="Times New Roman" w:cs="Times New Roman"/>
+        </w:rPr>
+        <w:t xml:space="preserve"> et al., 2020 #27484}</w:t>
+      </w:r>
+    </w:p>
+    <w:p>
+      <w:pPr>
+        <w:rPr>
+          <w:rFonts w:ascii="Times New Roman" w:hAnsi="Times New Roman" w:cs="Times New Roman"/>
+        </w:rPr>
+      </w:pPr>
+      <w:r>
+        <w:rPr>
+          <w:rFonts w:ascii="Times New Roman" w:hAnsi="Times New Roman" w:cs="Times New Roman"/>
+        </w:rPr>
+        <w:t>{</w:t>
+      </w:r>
+      <w:proofErr w:type="spellStart"/>
+      <w:r>
+        <w:rPr>
+          <w:rFonts w:ascii="Times New Roman" w:hAnsi="Times New Roman" w:cs="Times New Roman"/>
+        </w:rPr>
+        <w:t>Marzinelli</w:t>
+      </w:r>
+      <w:proofErr w:type="spellEnd"/>
+      <w:r>
+        <w:rPr>
+          <w:rFonts w:ascii="Times New Roman" w:hAnsi="Times New Roman" w:cs="Times New Roman"/>
+        </w:rPr>
+        <w:t xml:space="preserve"> et al., 2015 #13683}</w:t>
       </w:r>
     </w:p>
     <w:p>
@@ -764,32 +836,60 @@
         <w:rPr>
           <w:rFonts w:ascii="Times New Roman" w:hAnsi="Times New Roman" w:cs="Times New Roman"/>
         </w:rPr>
-        <w:t>{Zhu et al., 2017 #80561}</w:t>
-      </w:r>
-      <w:r>
-        <w:rPr>
-          <w:rFonts w:ascii="Times New Roman" w:hAnsi="Times New Roman" w:cs="Times New Roman"/>
-        </w:rPr>
-        <w:t>{Weigel and Pfister, 2021 #7619}</w:t>
-      </w:r>
-    </w:p>
-    <w:p>
-      <w:pPr>
-        <w:rPr>
-          <w:rFonts w:ascii="Times New Roman" w:hAnsi="Times New Roman" w:cs="Times New Roman"/>
-        </w:rPr>
-      </w:pPr>
-      <w:r>
-        <w:rPr>
-          <w:rFonts w:ascii="Times New Roman" w:hAnsi="Times New Roman" w:cs="Times New Roman"/>
-        </w:rPr>
-        <w:t>{Liang et al., 2021 #70561}</w:t>
-      </w:r>
-      <w:r>
-        <w:rPr>
-          <w:rFonts w:ascii="Times New Roman" w:hAnsi="Times New Roman" w:cs="Times New Roman"/>
-        </w:rPr>
-        <w:t>{Zhang et al., 2021 #3217}</w:t>
+        <w:t>{Zhu et al., 2017 #</w:t>
+      </w:r>
+      <w:proofErr w:type="gramStart"/>
+      <w:r>
+        <w:rPr>
+          <w:rFonts w:ascii="Times New Roman" w:hAnsi="Times New Roman" w:cs="Times New Roman"/>
+        </w:rPr>
+        <w:t>80561}</w:t>
+      </w:r>
+      <w:r>
+        <w:rPr>
+          <w:rFonts w:ascii="Times New Roman" w:hAnsi="Times New Roman" w:cs="Times New Roman"/>
+        </w:rPr>
+        <w:t>{</w:t>
+      </w:r>
+      <w:proofErr w:type="gramEnd"/>
+      <w:r>
+        <w:rPr>
+          <w:rFonts w:ascii="Times New Roman" w:hAnsi="Times New Roman" w:cs="Times New Roman"/>
+        </w:rPr>
+        <w:t>Weigel and Pfister, 2021 #7619}</w:t>
+      </w:r>
+    </w:p>
+    <w:p>
+      <w:pPr>
+        <w:rPr>
+          <w:rFonts w:ascii="Times New Roman" w:hAnsi="Times New Roman" w:cs="Times New Roman"/>
+        </w:rPr>
+      </w:pPr>
+      <w:r>
+        <w:rPr>
+          <w:rFonts w:ascii="Times New Roman" w:hAnsi="Times New Roman" w:cs="Times New Roman"/>
+        </w:rPr>
+        <w:t>{Liang et al., 2021 #</w:t>
+      </w:r>
+      <w:proofErr w:type="gramStart"/>
+      <w:r>
+        <w:rPr>
+          <w:rFonts w:ascii="Times New Roman" w:hAnsi="Times New Roman" w:cs="Times New Roman"/>
+        </w:rPr>
+        <w:t>70561}</w:t>
+      </w:r>
+      <w:r>
+        <w:rPr>
+          <w:rFonts w:ascii="Times New Roman" w:hAnsi="Times New Roman" w:cs="Times New Roman"/>
+        </w:rPr>
+        <w:t>{</w:t>
+      </w:r>
+      <w:proofErr w:type="gramEnd"/>
+      <w:r>
+        <w:rPr>
+          <w:rFonts w:ascii="Times New Roman" w:hAnsi="Times New Roman" w:cs="Times New Roman"/>
+        </w:rPr>
+        <w:t>Zhang et al., 2021 #3217}</w:t>
       </w:r>
     </w:p>
     <w:p>
@@ -815,22 +915,117 @@
         <w:rPr>
           <w:rFonts w:ascii="Times New Roman" w:hAnsi="Times New Roman" w:cs="Times New Roman"/>
         </w:rPr>
-        <w:t>{Perkins et al., 2021 #3089}{Perkins et al., 2023 #93452}</w:t>
-      </w:r>
-    </w:p>
-    <w:p>
-      <w:pPr>
-        <w:rPr>
-          <w:rFonts w:ascii="Times New Roman" w:hAnsi="Times New Roman" w:cs="Times New Roman"/>
-        </w:rPr>
-      </w:pPr>
-    </w:p>
-    <w:p>
-      <w:pPr>
-        <w:rPr>
-          <w:rFonts w:ascii="Times New Roman" w:hAnsi="Times New Roman" w:cs="Times New Roman"/>
-        </w:rPr>
-      </w:pPr>
+        <w:t>{Perkins et al., 2021 #</w:t>
+      </w:r>
+      <w:proofErr w:type="gramStart"/>
+      <w:r>
+        <w:rPr>
+          <w:rFonts w:ascii="Times New Roman" w:hAnsi="Times New Roman" w:cs="Times New Roman"/>
+        </w:rPr>
+        <w:t>3089}{</w:t>
+      </w:r>
+      <w:proofErr w:type="gramEnd"/>
+      <w:r>
+        <w:rPr>
+          <w:rFonts w:ascii="Times New Roman" w:hAnsi="Times New Roman" w:cs="Times New Roman"/>
+        </w:rPr>
+        <w:t>Perkins et al., 2023 #93452}</w:t>
+      </w:r>
+    </w:p>
+    <w:p>
+      <w:pPr>
+        <w:rPr>
+          <w:rFonts w:ascii="Times New Roman" w:hAnsi="Times New Roman" w:cs="Times New Roman"/>
+        </w:rPr>
+      </w:pPr>
+    </w:p>
+    <w:p>
+      <w:pPr>
+        <w:rPr>
+          <w:rFonts w:ascii="Times New Roman" w:hAnsi="Times New Roman" w:cs="Times New Roman"/>
+        </w:rPr>
+      </w:pPr>
+      <w:r>
+        <w:rPr>
+          <w:rFonts w:ascii="Times New Roman" w:hAnsi="Times New Roman" w:cs="Times New Roman"/>
+        </w:rPr>
+        <w:t>{Buck-Wiese et al., 2023 #54882}</w:t>
+      </w:r>
+    </w:p>
+    <w:p>
+      <w:pPr>
+        <w:rPr>
+          <w:rFonts w:ascii="Times New Roman" w:hAnsi="Times New Roman" w:cs="Times New Roman"/>
+        </w:rPr>
+      </w:pPr>
+    </w:p>
+    <w:p>
+      <w:pPr>
+        <w:rPr>
+          <w:rFonts w:ascii="Times New Roman" w:hAnsi="Times New Roman" w:cs="Times New Roman"/>
+        </w:rPr>
+      </w:pPr>
+    </w:p>
+    <w:p>
+      <w:pPr>
+        <w:rPr>
+          <w:rFonts w:ascii="Times New Roman" w:hAnsi="Times New Roman" w:cs="Times New Roman"/>
+        </w:rPr>
+      </w:pPr>
+      <w:proofErr w:type="spellStart"/>
+      <w:r>
+        <w:rPr>
+          <w:rFonts w:ascii="Times New Roman" w:hAnsi="Times New Roman" w:cs="Times New Roman"/>
+        </w:rPr>
+        <w:t>Autsralian</w:t>
+      </w:r>
+      <w:proofErr w:type="spellEnd"/>
+      <w:r>
+        <w:rPr>
+          <w:rFonts w:ascii="Times New Roman" w:hAnsi="Times New Roman" w:cs="Times New Roman"/>
+        </w:rPr>
+        <w:t xml:space="preserve"> kelp </w:t>
+      </w:r>
+      <w:r>
+        <w:rPr>
+          <w:rFonts w:ascii="Times New Roman" w:hAnsi="Times New Roman" w:cs="Times New Roman"/>
+        </w:rPr>
+        <w:t>{</w:t>
+      </w:r>
+      <w:proofErr w:type="spellStart"/>
+      <w:r>
+        <w:rPr>
+          <w:rFonts w:ascii="Times New Roman" w:hAnsi="Times New Roman" w:cs="Times New Roman"/>
+        </w:rPr>
+        <w:t>Marzinelli</w:t>
+      </w:r>
+      <w:proofErr w:type="spellEnd"/>
+      <w:r>
+        <w:rPr>
+          <w:rFonts w:ascii="Times New Roman" w:hAnsi="Times New Roman" w:cs="Times New Roman"/>
+        </w:rPr>
+        <w:t xml:space="preserve"> et al., 2015 #13683; Phelps et al., 2021 #</w:t>
+      </w:r>
+      <w:proofErr w:type="gramStart"/>
+      <w:r>
+        <w:rPr>
+          <w:rFonts w:ascii="Times New Roman" w:hAnsi="Times New Roman" w:cs="Times New Roman"/>
+        </w:rPr>
+        <w:t>92702}</w:t>
+      </w:r>
+      <w:r>
+        <w:rPr>
+          <w:rFonts w:ascii="Times New Roman" w:hAnsi="Times New Roman" w:cs="Times New Roman"/>
+        </w:rPr>
+        <w:t>{</w:t>
+      </w:r>
+      <w:proofErr w:type="gramEnd"/>
+      <w:r>
+        <w:rPr>
+          <w:rFonts w:ascii="Times New Roman" w:hAnsi="Times New Roman" w:cs="Times New Roman"/>
+        </w:rPr>
+        <w:t>Qiu et al., 2019 #84139}</w:t>
+      </w:r>
     </w:p>
     <w:p>
       <w:pPr>
@@ -853,151 +1048,611 @@
       <w:pPr>
         <w:rPr>
           <w:rFonts w:ascii="Times New Roman" w:hAnsi="Times New Roman" w:cs="Times New Roman"/>
-        </w:rPr>
-      </w:pPr>
-    </w:p>
-    <w:p>
-      <w:pPr>
-        <w:rPr>
-          <w:rFonts w:ascii="Times New Roman" w:hAnsi="Times New Roman" w:cs="Times New Roman"/>
-        </w:rPr>
-      </w:pPr>
-      <w:r>
-        <w:rPr>
-          <w:rFonts w:ascii="Times New Roman" w:hAnsi="Times New Roman" w:cs="Times New Roman"/>
-        </w:rPr>
-        <w:t>(macroalga* OR kelp* OR seaweed*) AND (cultivat* OR isolat* OR strain*) AND (decay* OR degrad* OR decompos*) AND (bacter* OR microb* OR saprotroph* OR microheterotroph*) AND (algina* OR carrageen* OR agar* OR cellul* OR laminar* OR fucan* OR fucoidan*)</w:t>
-      </w:r>
-    </w:p>
-    <w:p>
-      <w:pPr>
-        <w:rPr>
-          <w:rFonts w:ascii="Times New Roman" w:hAnsi="Times New Roman" w:cs="Times New Roman"/>
-        </w:rPr>
-      </w:pPr>
-    </w:p>
-    <w:p>
-      <w:pPr>
-        <w:rPr>
-          <w:rFonts w:ascii="Times New Roman" w:hAnsi="Times New Roman" w:cs="Times New Roman"/>
-        </w:rPr>
-      </w:pPr>
-      <w:r>
-        <w:rPr>
-          <w:rFonts w:ascii="Times New Roman" w:hAnsi="Times New Roman" w:cs="Times New Roman"/>
-        </w:rPr>
-        <w:t xml:space="preserve">Alteromonas </w:t>
-      </w:r>
-      <w:r>
-        <w:rPr>
-          <w:rFonts w:ascii="Times New Roman" w:hAnsi="Times New Roman" w:cs="Times New Roman"/>
-        </w:rPr>
-        <w:t>{Neumann et al., 2015 #282670}{Uchida et al., 1995 #108927}</w:t>
-      </w:r>
-      <w:r>
-        <w:rPr>
-          <w:rFonts w:ascii="Times New Roman" w:hAnsi="Times New Roman" w:cs="Times New Roman"/>
-        </w:rPr>
-        <w:t xml:space="preserve"> </w:t>
-      </w:r>
-      <w:r>
-        <w:rPr>
-          <w:rFonts w:ascii="Times New Roman" w:hAnsi="Times New Roman" w:cs="Times New Roman"/>
-        </w:rPr>
-        <w:t xml:space="preserve">Pseudoalteromonas </w:t>
-      </w:r>
-      <w:r>
-        <w:rPr>
-          <w:rFonts w:ascii="Times New Roman" w:hAnsi="Times New Roman" w:cs="Times New Roman"/>
-        </w:rPr>
-        <w:t>{Xu et al., 2021 #143250}</w:t>
-      </w:r>
-      <w:r>
-        <w:rPr>
-          <w:rFonts w:ascii="Times New Roman" w:hAnsi="Times New Roman" w:cs="Times New Roman"/>
-        </w:rPr>
-        <w:t xml:space="preserve"> </w:t>
-      </w:r>
-      <w:r>
-        <w:rPr>
-          <w:rFonts w:ascii="Times New Roman" w:hAnsi="Times New Roman" w:cs="Times New Roman"/>
-        </w:rPr>
-        <w:t xml:space="preserve">Vibrio </w:t>
-      </w:r>
-      <w:r>
-        <w:rPr>
-          <w:rFonts w:ascii="Times New Roman" w:hAnsi="Times New Roman" w:cs="Times New Roman"/>
-        </w:rPr>
-        <w:t>{Corzett et al., 2018 #277055}</w:t>
-      </w:r>
-      <w:r>
-        <w:rPr>
-          <w:rFonts w:ascii="Times New Roman" w:hAnsi="Times New Roman" w:cs="Times New Roman"/>
-        </w:rPr>
-        <w:t xml:space="preserve"> Zobellia </w:t>
-      </w:r>
-      <w:r>
-        <w:rPr>
-          <w:rFonts w:ascii="Times New Roman" w:hAnsi="Times New Roman" w:cs="Times New Roman"/>
-        </w:rPr>
-        <w:t>{Barbeyron et al., 2016 #64925}{Brunet et al., 2022 #88820}</w:t>
-      </w:r>
-      <w:r>
-        <w:rPr>
-          <w:rFonts w:ascii="Times New Roman" w:hAnsi="Times New Roman" w:cs="Times New Roman"/>
-        </w:rPr>
-        <w:t xml:space="preserve"> Lentimonas </w:t>
-      </w:r>
-      <w:r>
-        <w:rPr>
-          <w:rFonts w:ascii="Times New Roman" w:hAnsi="Times New Roman" w:cs="Times New Roman"/>
-        </w:rPr>
-        <w:t>{Sichert et al., 2020 #88019}</w:t>
-      </w:r>
-    </w:p>
-    <w:p>
-      <w:pPr>
-        <w:rPr>
-          <w:rFonts w:ascii="Times New Roman" w:hAnsi="Times New Roman" w:cs="Times New Roman"/>
-        </w:rPr>
-      </w:pPr>
-    </w:p>
-    <w:p>
-      <w:pPr>
-        <w:rPr>
-          <w:rFonts w:ascii="Times New Roman" w:hAnsi="Times New Roman" w:cs="Times New Roman"/>
-        </w:rPr>
-      </w:pPr>
-    </w:p>
-    <w:p>
-      <w:pPr>
-        <w:rPr>
-          <w:rFonts w:ascii="Times New Roman" w:hAnsi="Times New Roman" w:cs="Times New Roman"/>
           <w:b/>
           <w:bCs/>
         </w:rPr>
       </w:pPr>
-      <w:r>
+    </w:p>
+    <w:p>
+      <w:pPr>
+        <w:rPr>
+          <w:rFonts w:ascii="Times New Roman" w:hAnsi="Times New Roman" w:cs="Times New Roman"/>
+        </w:rPr>
+      </w:pPr>
+      <w:r>
+        <w:rPr>
+          <w:rFonts w:ascii="Times New Roman" w:hAnsi="Times New Roman" w:cs="Times New Roman"/>
+        </w:rPr>
+        <w:t xml:space="preserve">Beta glucosidase is relevant to </w:t>
+      </w:r>
+      <w:proofErr w:type="gramStart"/>
+      <w:r>
+        <w:rPr>
+          <w:rFonts w:ascii="Times New Roman" w:hAnsi="Times New Roman" w:cs="Times New Roman"/>
+        </w:rPr>
+        <w:t>late stage</w:t>
+      </w:r>
+      <w:proofErr w:type="gramEnd"/>
+      <w:r>
+        <w:rPr>
+          <w:rFonts w:ascii="Times New Roman" w:hAnsi="Times New Roman" w:cs="Times New Roman"/>
+        </w:rPr>
+        <w:t xml:space="preserve"> terminal end cellulose and laminarin degradation</w:t>
+      </w:r>
+    </w:p>
+    <w:p>
+      <w:pPr>
+        <w:rPr>
+          <w:rFonts w:ascii="Times New Roman" w:hAnsi="Times New Roman" w:cs="Times New Roman"/>
+        </w:rPr>
+      </w:pPr>
+    </w:p>
+    <w:p>
+      <w:pPr>
+        <w:rPr>
+          <w:rFonts w:ascii="Times New Roman" w:hAnsi="Times New Roman" w:cs="Times New Roman"/>
+        </w:rPr>
+      </w:pPr>
+    </w:p>
+    <w:p>
+      <w:pPr>
+        <w:rPr>
+          <w:rFonts w:ascii="Arial" w:hAnsi="Arial" w:cs="Arial"/>
+          <w:color w:val="000000"/>
+          <w:kern w:val="0"/>
+          <w:sz w:val="26"/>
+          <w:szCs w:val="26"/>
+        </w:rPr>
+      </w:pPr>
+      <w:r>
+        <w:rPr>
+          <w:rFonts w:ascii="Times New Roman" w:hAnsi="Times New Roman" w:cs="Times New Roman"/>
+        </w:rPr>
+        <w:t xml:space="preserve">Started with previous reviews and then did literature search. Often </w:t>
+      </w:r>
+      <w:r>
+        <w:rPr>
+          <w:rFonts w:ascii="Arial" w:hAnsi="Arial" w:cs="Arial"/>
+          <w:color w:val="000000"/>
+          <w:kern w:val="0"/>
+          <w:sz w:val="26"/>
+          <w:szCs w:val="26"/>
+        </w:rPr>
+        <w:t xml:space="preserve">Int J </w:t>
+      </w:r>
+      <w:proofErr w:type="spellStart"/>
+      <w:r>
+        <w:rPr>
+          <w:rFonts w:ascii="Arial" w:hAnsi="Arial" w:cs="Arial"/>
+          <w:color w:val="000000"/>
+          <w:kern w:val="0"/>
+          <w:sz w:val="26"/>
+          <w:szCs w:val="26"/>
+        </w:rPr>
+        <w:t>Syst</w:t>
+      </w:r>
+      <w:proofErr w:type="spellEnd"/>
+      <w:r>
+        <w:rPr>
+          <w:rFonts w:ascii="Arial" w:hAnsi="Arial" w:cs="Arial"/>
+          <w:color w:val="000000"/>
+          <w:kern w:val="0"/>
+          <w:sz w:val="26"/>
+          <w:szCs w:val="26"/>
+        </w:rPr>
+        <w:t xml:space="preserve"> Evol </w:t>
+      </w:r>
+      <w:proofErr w:type="spellStart"/>
+      <w:r>
+        <w:rPr>
+          <w:rFonts w:ascii="Arial" w:hAnsi="Arial" w:cs="Arial"/>
+          <w:color w:val="000000"/>
+          <w:kern w:val="0"/>
+          <w:sz w:val="26"/>
+          <w:szCs w:val="26"/>
+        </w:rPr>
+        <w:t>Microbiol</w:t>
+      </w:r>
+      <w:proofErr w:type="spellEnd"/>
+      <w:r>
+        <w:rPr>
+          <w:rFonts w:ascii="Arial" w:hAnsi="Arial" w:cs="Arial"/>
+          <w:color w:val="000000"/>
+          <w:kern w:val="0"/>
+          <w:sz w:val="26"/>
+          <w:szCs w:val="26"/>
+        </w:rPr>
+        <w:t xml:space="preserve"> and then subsequent records, excluded purely </w:t>
+      </w:r>
+      <w:proofErr w:type="spellStart"/>
+      <w:r>
+        <w:rPr>
+          <w:rFonts w:ascii="Arial" w:hAnsi="Arial" w:cs="Arial"/>
+          <w:color w:val="000000"/>
+          <w:kern w:val="0"/>
+          <w:sz w:val="26"/>
+          <w:szCs w:val="26"/>
+        </w:rPr>
+        <w:t>genertic</w:t>
+      </w:r>
+      <w:proofErr w:type="spellEnd"/>
+      <w:r>
+        <w:rPr>
+          <w:rFonts w:ascii="Arial" w:hAnsi="Arial" w:cs="Arial"/>
+          <w:color w:val="000000"/>
+          <w:kern w:val="0"/>
+          <w:sz w:val="26"/>
+          <w:szCs w:val="26"/>
+        </w:rPr>
+        <w:t xml:space="preserve"> studies (putative function) and studies that extracted genes, inserted into E coli and experimented with the produced enzyme</w:t>
+      </w:r>
+    </w:p>
+    <w:p>
+      <w:pPr>
+        <w:rPr>
+          <w:rFonts w:ascii="Times New Roman" w:hAnsi="Times New Roman" w:cs="Times New Roman"/>
+        </w:rPr>
+      </w:pPr>
+    </w:p>
+    <w:p>
+      <w:pPr>
+        <w:rPr>
+          <w:rFonts w:ascii="Times New Roman" w:hAnsi="Times New Roman" w:cs="Times New Roman"/>
+        </w:rPr>
+      </w:pPr>
+      <w:r>
+        <w:rPr>
+          <w:rFonts w:ascii="Times New Roman" w:hAnsi="Times New Roman" w:cs="Times New Roman"/>
+        </w:rPr>
+        <w:t>(macroalga* OR kelp* OR seaweed*) AND (</w:t>
+      </w:r>
+      <w:proofErr w:type="spellStart"/>
+      <w:r>
+        <w:rPr>
+          <w:rFonts w:ascii="Times New Roman" w:hAnsi="Times New Roman" w:cs="Times New Roman"/>
+        </w:rPr>
+        <w:t>cultivat</w:t>
+      </w:r>
+      <w:proofErr w:type="spellEnd"/>
+      <w:r>
+        <w:rPr>
+          <w:rFonts w:ascii="Times New Roman" w:hAnsi="Times New Roman" w:cs="Times New Roman"/>
+        </w:rPr>
+        <w:t xml:space="preserve">* OR </w:t>
+      </w:r>
+      <w:proofErr w:type="spellStart"/>
+      <w:r>
+        <w:rPr>
+          <w:rFonts w:ascii="Times New Roman" w:hAnsi="Times New Roman" w:cs="Times New Roman"/>
+        </w:rPr>
+        <w:t>isolat</w:t>
+      </w:r>
+      <w:proofErr w:type="spellEnd"/>
+      <w:r>
+        <w:rPr>
+          <w:rFonts w:ascii="Times New Roman" w:hAnsi="Times New Roman" w:cs="Times New Roman"/>
+        </w:rPr>
+        <w:t xml:space="preserve">* OR strain*) AND (decay* OR </w:t>
+      </w:r>
+      <w:proofErr w:type="spellStart"/>
+      <w:r>
+        <w:rPr>
+          <w:rFonts w:ascii="Times New Roman" w:hAnsi="Times New Roman" w:cs="Times New Roman"/>
+        </w:rPr>
+        <w:t>degrad</w:t>
+      </w:r>
+      <w:proofErr w:type="spellEnd"/>
+      <w:r>
+        <w:rPr>
+          <w:rFonts w:ascii="Times New Roman" w:hAnsi="Times New Roman" w:cs="Times New Roman"/>
+        </w:rPr>
+        <w:t xml:space="preserve">* OR </w:t>
+      </w:r>
+      <w:proofErr w:type="spellStart"/>
+      <w:r>
+        <w:rPr>
+          <w:rFonts w:ascii="Times New Roman" w:hAnsi="Times New Roman" w:cs="Times New Roman"/>
+        </w:rPr>
+        <w:t>decompos</w:t>
+      </w:r>
+      <w:proofErr w:type="spellEnd"/>
+      <w:r>
+        <w:rPr>
+          <w:rFonts w:ascii="Times New Roman" w:hAnsi="Times New Roman" w:cs="Times New Roman"/>
+        </w:rPr>
+        <w:t>*) AND (</w:t>
+      </w:r>
+      <w:proofErr w:type="spellStart"/>
+      <w:r>
+        <w:rPr>
+          <w:rFonts w:ascii="Times New Roman" w:hAnsi="Times New Roman" w:cs="Times New Roman"/>
+        </w:rPr>
+        <w:t>bacter</w:t>
+      </w:r>
+      <w:proofErr w:type="spellEnd"/>
+      <w:r>
+        <w:rPr>
+          <w:rFonts w:ascii="Times New Roman" w:hAnsi="Times New Roman" w:cs="Times New Roman"/>
+        </w:rPr>
+        <w:t xml:space="preserve">* OR </w:t>
+      </w:r>
+      <w:proofErr w:type="spellStart"/>
+      <w:r>
+        <w:rPr>
+          <w:rFonts w:ascii="Times New Roman" w:hAnsi="Times New Roman" w:cs="Times New Roman"/>
+        </w:rPr>
+        <w:t>microb</w:t>
+      </w:r>
+      <w:proofErr w:type="spellEnd"/>
+      <w:r>
+        <w:rPr>
+          <w:rFonts w:ascii="Times New Roman" w:hAnsi="Times New Roman" w:cs="Times New Roman"/>
+        </w:rPr>
+        <w:t xml:space="preserve">* OR saprotroph* OR </w:t>
+      </w:r>
+      <w:proofErr w:type="spellStart"/>
+      <w:r>
+        <w:rPr>
+          <w:rFonts w:ascii="Times New Roman" w:hAnsi="Times New Roman" w:cs="Times New Roman"/>
+        </w:rPr>
+        <w:t>microheterotroph</w:t>
+      </w:r>
+      <w:proofErr w:type="spellEnd"/>
+      <w:r>
+        <w:rPr>
+          <w:rFonts w:ascii="Times New Roman" w:hAnsi="Times New Roman" w:cs="Times New Roman"/>
+        </w:rPr>
+        <w:t>*) AND (</w:t>
+      </w:r>
+      <w:proofErr w:type="spellStart"/>
+      <w:r>
+        <w:rPr>
+          <w:rFonts w:ascii="Times New Roman" w:hAnsi="Times New Roman" w:cs="Times New Roman"/>
+        </w:rPr>
+        <w:t>algina</w:t>
+      </w:r>
+      <w:proofErr w:type="spellEnd"/>
+      <w:r>
+        <w:rPr>
+          <w:rFonts w:ascii="Times New Roman" w:hAnsi="Times New Roman" w:cs="Times New Roman"/>
+        </w:rPr>
+        <w:t xml:space="preserve">* OR carrageen* OR agar* OR </w:t>
+      </w:r>
+      <w:proofErr w:type="spellStart"/>
+      <w:r>
+        <w:rPr>
+          <w:rFonts w:ascii="Times New Roman" w:hAnsi="Times New Roman" w:cs="Times New Roman"/>
+        </w:rPr>
+        <w:t>cellul</w:t>
+      </w:r>
+      <w:proofErr w:type="spellEnd"/>
+      <w:r>
+        <w:rPr>
+          <w:rFonts w:ascii="Times New Roman" w:hAnsi="Times New Roman" w:cs="Times New Roman"/>
+        </w:rPr>
+        <w:t xml:space="preserve">* OR laminar* OR </w:t>
+      </w:r>
+      <w:proofErr w:type="spellStart"/>
+      <w:r>
+        <w:rPr>
+          <w:rFonts w:ascii="Times New Roman" w:hAnsi="Times New Roman" w:cs="Times New Roman"/>
+        </w:rPr>
+        <w:t>fucan</w:t>
+      </w:r>
+      <w:proofErr w:type="spellEnd"/>
+      <w:r>
+        <w:rPr>
+          <w:rFonts w:ascii="Times New Roman" w:hAnsi="Times New Roman" w:cs="Times New Roman"/>
+        </w:rPr>
+        <w:t>* OR fucoidan*)</w:t>
+      </w:r>
+    </w:p>
+    <w:p>
+      <w:pPr>
+        <w:rPr>
+          <w:rFonts w:ascii="Times New Roman" w:hAnsi="Times New Roman" w:cs="Times New Roman"/>
+        </w:rPr>
+      </w:pPr>
+    </w:p>
+    <w:p>
+      <w:pPr>
+        <w:pStyle w:val="p1"/>
+        <w:rPr>
+          <w:rFonts w:ascii="Times New Roman" w:hAnsi="Times New Roman"/>
+          <w:sz w:val="24"/>
+          <w:szCs w:val="24"/>
+        </w:rPr>
+      </w:pPr>
+      <w:proofErr w:type="spellStart"/>
+      <w:r>
+        <w:rPr>
+          <w:rFonts w:ascii="Times New Roman" w:hAnsi="Times New Roman"/>
+          <w:sz w:val="24"/>
+          <w:szCs w:val="24"/>
+        </w:rPr>
+        <w:t>Planctomyceota</w:t>
+      </w:r>
+      <w:proofErr w:type="spellEnd"/>
+      <w:r>
+        <w:rPr>
+          <w:rFonts w:ascii="Times New Roman" w:hAnsi="Times New Roman"/>
+          <w:sz w:val="24"/>
+          <w:szCs w:val="24"/>
+        </w:rPr>
+        <w:t xml:space="preserve"> </w:t>
+      </w:r>
+      <w:r>
+        <w:rPr>
+          <w:rFonts w:ascii="Times New Roman" w:hAnsi="Times New Roman"/>
+          <w:sz w:val="24"/>
+          <w:szCs w:val="24"/>
+        </w:rPr>
+        <w:t>Pérez-Cruz</w:t>
+      </w:r>
+      <w:r>
+        <w:rPr>
+          <w:rFonts w:ascii="Times New Roman" w:hAnsi="Times New Roman"/>
+          <w:sz w:val="24"/>
+          <w:szCs w:val="24"/>
+        </w:rPr>
+        <w:t xml:space="preserve"> et al. 2024 </w:t>
+      </w:r>
+    </w:p>
+    <w:p>
+      <w:pPr>
+        <w:rPr>
+          <w:rFonts w:ascii="Times New Roman" w:hAnsi="Times New Roman" w:cs="Times New Roman"/>
+        </w:rPr>
+      </w:pPr>
+    </w:p>
+    <w:p>
+      <w:pPr>
+        <w:rPr>
+          <w:rFonts w:ascii="Times New Roman" w:hAnsi="Times New Roman" w:cs="Times New Roman"/>
+        </w:rPr>
+      </w:pPr>
+      <w:proofErr w:type="spellStart"/>
+      <w:r>
+        <w:rPr>
+          <w:rFonts w:ascii="Times New Roman" w:hAnsi="Times New Roman" w:cs="Times New Roman"/>
+        </w:rPr>
+        <w:t>Alteromonas</w:t>
+      </w:r>
+      <w:proofErr w:type="spellEnd"/>
+      <w:r>
+        <w:rPr>
+          <w:rFonts w:ascii="Times New Roman" w:hAnsi="Times New Roman" w:cs="Times New Roman"/>
+        </w:rPr>
+        <w:t xml:space="preserve"> </w:t>
+      </w:r>
+      <w:r>
+        <w:rPr>
+          <w:rFonts w:ascii="Times New Roman" w:hAnsi="Times New Roman" w:cs="Times New Roman"/>
+        </w:rPr>
+        <w:t xml:space="preserve">Koch et al. 2019 </w:t>
+      </w:r>
+      <w:r>
+        <w:rPr>
+          <w:rFonts w:ascii="Times New Roman" w:hAnsi="Times New Roman" w:cs="Times New Roman"/>
+        </w:rPr>
+        <w:t>{Neumann et al., 2015 #</w:t>
+      </w:r>
+      <w:proofErr w:type="gramStart"/>
+      <w:r>
+        <w:rPr>
+          <w:rFonts w:ascii="Times New Roman" w:hAnsi="Times New Roman" w:cs="Times New Roman"/>
+        </w:rPr>
+        <w:t>282670}{</w:t>
+      </w:r>
+      <w:proofErr w:type="gramEnd"/>
+      <w:r>
+        <w:rPr>
+          <w:rFonts w:ascii="Times New Roman" w:hAnsi="Times New Roman" w:cs="Times New Roman"/>
+        </w:rPr>
+        <w:t>Uchida et al., 1995 #108927}</w:t>
+      </w:r>
+      <w:r>
+        <w:rPr>
+          <w:rFonts w:ascii="Times New Roman" w:hAnsi="Times New Roman" w:cs="Times New Roman"/>
+        </w:rPr>
+        <w:t xml:space="preserve"> </w:t>
+      </w:r>
+      <w:proofErr w:type="spellStart"/>
+      <w:r>
+        <w:rPr>
+          <w:rFonts w:ascii="Times New Roman" w:hAnsi="Times New Roman" w:cs="Times New Roman"/>
+        </w:rPr>
+        <w:t>Pseudoalteromonas</w:t>
+      </w:r>
+      <w:proofErr w:type="spellEnd"/>
+      <w:r>
+        <w:rPr>
+          <w:rFonts w:ascii="Times New Roman" w:hAnsi="Times New Roman" w:cs="Times New Roman"/>
+        </w:rPr>
+        <w:t xml:space="preserve"> </w:t>
+      </w:r>
+      <w:r>
+        <w:rPr>
+          <w:rFonts w:ascii="Times New Roman" w:hAnsi="Times New Roman" w:cs="Times New Roman"/>
+        </w:rPr>
+        <w:t>{Xu et al., 2021 #143250}</w:t>
+      </w:r>
+      <w:r>
+        <w:rPr>
+          <w:rFonts w:ascii="Times New Roman" w:hAnsi="Times New Roman" w:cs="Times New Roman"/>
+        </w:rPr>
+        <w:t xml:space="preserve"> </w:t>
+      </w:r>
+      <w:r>
+        <w:rPr>
+          <w:rFonts w:ascii="Times New Roman" w:hAnsi="Times New Roman" w:cs="Times New Roman"/>
+        </w:rPr>
+        <w:t xml:space="preserve">Vibrio </w:t>
+      </w:r>
+      <w:r>
+        <w:rPr>
+          <w:rFonts w:ascii="Times New Roman" w:hAnsi="Times New Roman" w:cs="Times New Roman"/>
+        </w:rPr>
+        <w:t>{</w:t>
+      </w:r>
+      <w:proofErr w:type="spellStart"/>
+      <w:r>
+        <w:rPr>
+          <w:rFonts w:ascii="Times New Roman" w:hAnsi="Times New Roman" w:cs="Times New Roman"/>
+        </w:rPr>
+        <w:t>Corzett</w:t>
+      </w:r>
+      <w:proofErr w:type="spellEnd"/>
+      <w:r>
+        <w:rPr>
+          <w:rFonts w:ascii="Times New Roman" w:hAnsi="Times New Roman" w:cs="Times New Roman"/>
+        </w:rPr>
+        <w:t xml:space="preserve"> et al., 2018 #277055}</w:t>
+      </w:r>
+      <w:r>
+        <w:rPr>
+          <w:rFonts w:ascii="Times New Roman" w:hAnsi="Times New Roman" w:cs="Times New Roman"/>
+        </w:rPr>
+        <w:t xml:space="preserve"> </w:t>
+      </w:r>
+      <w:proofErr w:type="spellStart"/>
+      <w:r>
+        <w:rPr>
+          <w:rFonts w:ascii="Times New Roman" w:hAnsi="Times New Roman" w:cs="Times New Roman"/>
+        </w:rPr>
+        <w:t>Zobellia</w:t>
+      </w:r>
+      <w:proofErr w:type="spellEnd"/>
+      <w:r>
+        <w:rPr>
+          <w:rFonts w:ascii="Times New Roman" w:hAnsi="Times New Roman" w:cs="Times New Roman"/>
+        </w:rPr>
+        <w:t xml:space="preserve"> </w:t>
+      </w:r>
+      <w:r>
+        <w:rPr>
+          <w:rFonts w:ascii="Times New Roman" w:hAnsi="Times New Roman" w:cs="Times New Roman"/>
+        </w:rPr>
+        <w:t>{</w:t>
+      </w:r>
+      <w:proofErr w:type="spellStart"/>
+      <w:r>
+        <w:rPr>
+          <w:rFonts w:ascii="Times New Roman" w:hAnsi="Times New Roman" w:cs="Times New Roman"/>
+        </w:rPr>
+        <w:t>Barbeyron</w:t>
+      </w:r>
+      <w:proofErr w:type="spellEnd"/>
+      <w:r>
+        <w:rPr>
+          <w:rFonts w:ascii="Times New Roman" w:hAnsi="Times New Roman" w:cs="Times New Roman"/>
+        </w:rPr>
+        <w:t xml:space="preserve"> et al., 2016 #</w:t>
+      </w:r>
+      <w:proofErr w:type="gramStart"/>
+      <w:r>
+        <w:rPr>
+          <w:rFonts w:ascii="Times New Roman" w:hAnsi="Times New Roman" w:cs="Times New Roman"/>
+        </w:rPr>
+        <w:t>64925}{</w:t>
+      </w:r>
+      <w:proofErr w:type="gramEnd"/>
+      <w:r>
+        <w:rPr>
+          <w:rFonts w:ascii="Times New Roman" w:hAnsi="Times New Roman" w:cs="Times New Roman"/>
+        </w:rPr>
+        <w:t>Brunet et al., 2022 #88820}</w:t>
+      </w:r>
+      <w:r>
+        <w:rPr>
+          <w:rFonts w:ascii="Times New Roman" w:hAnsi="Times New Roman" w:cs="Times New Roman"/>
+        </w:rPr>
+        <w:t xml:space="preserve"> </w:t>
+      </w:r>
+      <w:proofErr w:type="spellStart"/>
+      <w:r>
+        <w:rPr>
+          <w:rFonts w:ascii="Times New Roman" w:hAnsi="Times New Roman" w:cs="Times New Roman"/>
+        </w:rPr>
+        <w:t>Lentimonas</w:t>
+      </w:r>
+      <w:proofErr w:type="spellEnd"/>
+      <w:r>
+        <w:rPr>
+          <w:rFonts w:ascii="Times New Roman" w:hAnsi="Times New Roman" w:cs="Times New Roman"/>
+        </w:rPr>
+        <w:t xml:space="preserve"> </w:t>
+      </w:r>
+      <w:r>
+        <w:rPr>
+          <w:rFonts w:ascii="Times New Roman" w:hAnsi="Times New Roman" w:cs="Times New Roman"/>
+        </w:rPr>
+        <w:t>{Sichert et al., 2020 #88019}</w:t>
+      </w:r>
+    </w:p>
+    <w:p>
+      <w:pPr>
+        <w:rPr>
+          <w:rFonts w:ascii="Times New Roman" w:hAnsi="Times New Roman" w:cs="Times New Roman"/>
+        </w:rPr>
+      </w:pPr>
+    </w:p>
+    <w:p>
+      <w:pPr>
+        <w:rPr>
+          <w:rFonts w:ascii="Times New Roman" w:hAnsi="Times New Roman" w:cs="Times New Roman"/>
+        </w:rPr>
+      </w:pPr>
+      <w:r>
+        <w:rPr>
+          <w:rFonts w:ascii="Times New Roman" w:hAnsi="Times New Roman" w:cs="Times New Roman"/>
+        </w:rPr>
+        <w:t xml:space="preserve">Koch et al. 2020 E. radiata unaffected by </w:t>
+      </w:r>
+      <w:proofErr w:type="spellStart"/>
+      <w:r>
+        <w:rPr>
+          <w:rFonts w:ascii="Times New Roman" w:hAnsi="Times New Roman" w:cs="Times New Roman"/>
+        </w:rPr>
+        <w:t>Alteromonas</w:t>
+      </w:r>
+      <w:proofErr w:type="spellEnd"/>
+      <w:r>
+        <w:rPr>
+          <w:rFonts w:ascii="Times New Roman" w:hAnsi="Times New Roman" w:cs="Times New Roman"/>
+        </w:rPr>
+        <w:t xml:space="preserve"> </w:t>
+      </w:r>
+      <w:proofErr w:type="spellStart"/>
+      <w:r>
+        <w:rPr>
+          <w:rFonts w:ascii="Times New Roman" w:hAnsi="Times New Roman" w:cs="Times New Roman"/>
+        </w:rPr>
+        <w:t>macleodii</w:t>
+      </w:r>
+      <w:proofErr w:type="spellEnd"/>
+    </w:p>
+    <w:p>
+      <w:pPr>
+        <w:rPr>
+          <w:rFonts w:ascii="Times New Roman" w:hAnsi="Times New Roman" w:cs="Times New Roman"/>
+        </w:rPr>
+      </w:pPr>
+    </w:p>
+    <w:p>
+      <w:pPr>
+        <w:rPr>
+          <w:rFonts w:ascii="Times New Roman" w:hAnsi="Times New Roman" w:cs="Times New Roman"/>
+        </w:rPr>
+      </w:pPr>
+    </w:p>
+    <w:p>
+      <w:pPr>
         <w:rPr>
           <w:rFonts w:ascii="Times New Roman" w:hAnsi="Times New Roman" w:cs="Times New Roman"/>
           <w:b/>
           <w:bCs/>
         </w:rPr>
-        <w:t>Results</w:t>
-      </w:r>
-    </w:p>
-    <w:p>
-      <w:pPr>
-        <w:rPr>
-          <w:rFonts w:ascii="Times New Roman" w:hAnsi="Times New Roman" w:cs="Times New Roman"/>
-        </w:rPr>
-      </w:pPr>
-    </w:p>
-    <w:p>
-      <w:pPr>
-        <w:rPr>
-          <w:rFonts w:ascii="Times New Roman" w:hAnsi="Times New Roman" w:cs="Times New Roman"/>
-        </w:rPr>
       </w:pPr>
       <w:r>
         <w:rPr>
@@ -1005,13 +1660,7 @@
           <w:b/>
           <w:bCs/>
         </w:rPr>
-        <w:t>Figure 1</w:t>
-      </w:r>
-      <w:r>
-        <w:rPr>
-          <w:rFonts w:ascii="Times New Roman" w:hAnsi="Times New Roman" w:cs="Times New Roman"/>
-        </w:rPr>
-        <w:t>. Timeseries. A, Mass, B, k, C, half-life, D, respiration, E, beta glucosidase, F, leucine aminopeptidase, G, microbial richness, H, microbial abundance.</w:t>
+        <w:t>Results</w:t>
       </w:r>
     </w:p>
     <w:p>
@@ -1033,19 +1682,27 @@
           <w:b/>
           <w:bCs/>
         </w:rPr>
-        <w:t>Figure 2</w:t>
-      </w:r>
-      <w:r>
-        <w:rPr>
-          <w:rFonts w:ascii="Times New Roman" w:hAnsi="Times New Roman" w:cs="Times New Roman"/>
-        </w:rPr>
-        <w:t>. Predictive modelling</w:t>
-      </w:r>
-      <w:r>
-        <w:rPr>
-          <w:rFonts w:ascii="Times New Roman" w:hAnsi="Times New Roman" w:cs="Times New Roman"/>
-        </w:rPr>
-        <w:t>. A, k vs. respiration, B, k vs. enzymes, C, k vs. microbial richness, D, k vs. microbial abundance.</w:t>
+        <w:t>Figure 1</w:t>
+      </w:r>
+      <w:r>
+        <w:rPr>
+          <w:rFonts w:ascii="Times New Roman" w:hAnsi="Times New Roman" w:cs="Times New Roman"/>
+        </w:rPr>
+        <w:t xml:space="preserve">. Timeseries. </w:t>
+      </w:r>
+      <w:proofErr w:type="gramStart"/>
+      <w:r>
+        <w:rPr>
+          <w:rFonts w:ascii="Times New Roman" w:hAnsi="Times New Roman" w:cs="Times New Roman"/>
+        </w:rPr>
+        <w:t>A,</w:t>
+      </w:r>
+      <w:proofErr w:type="gramEnd"/>
+      <w:r>
+        <w:rPr>
+          <w:rFonts w:ascii="Times New Roman" w:hAnsi="Times New Roman" w:cs="Times New Roman"/>
+        </w:rPr>
+        <w:t xml:space="preserve"> Mass, B, k, C, half-life, D, respiration, E, beta glucosidase, F, leucine aminopeptidase, G, microbial richness, H, microbial abundance.</w:t>
       </w:r>
     </w:p>
     <w:p>
@@ -1067,37 +1724,19 @@
           <w:b/>
           <w:bCs/>
         </w:rPr>
-        <w:t>Figure 3</w:t>
-      </w:r>
-      <w:r>
-        <w:rPr>
-          <w:rFonts w:ascii="Times New Roman" w:hAnsi="Times New Roman" w:cs="Times New Roman"/>
-        </w:rPr>
-        <w:t>. Microbial identity</w:t>
-      </w:r>
-      <w:r>
-        <w:rPr>
-          <w:rFonts w:ascii="Times New Roman" w:hAnsi="Times New Roman" w:cs="Times New Roman"/>
-        </w:rPr>
-        <w:t xml:space="preserve"> deep-dive</w:t>
-      </w:r>
-      <w:r>
-        <w:rPr>
-          <w:rFonts w:ascii="Times New Roman" w:hAnsi="Times New Roman" w:cs="Times New Roman"/>
-        </w:rPr>
-        <w:t xml:space="preserve">. A, </w:t>
-      </w:r>
-      <w:r>
-        <w:rPr>
-          <w:rFonts w:ascii="Times New Roman" w:hAnsi="Times New Roman" w:cs="Times New Roman"/>
-        </w:rPr>
-        <w:t xml:space="preserve">nMDS, B, </w:t>
-      </w:r>
-      <w:r>
-        <w:rPr>
-          <w:rFonts w:ascii="Times New Roman" w:hAnsi="Times New Roman" w:cs="Times New Roman"/>
-        </w:rPr>
-        <w:t>ASVs vs. time, C, ASVs vs. enyzmes</w:t>
+        <w:t>Figure 2</w:t>
+      </w:r>
+      <w:r>
+        <w:rPr>
+          <w:rFonts w:ascii="Times New Roman" w:hAnsi="Times New Roman" w:cs="Times New Roman"/>
+        </w:rPr>
+        <w:t>. Predictive modelling</w:t>
+      </w:r>
+      <w:r>
+        <w:rPr>
+          <w:rFonts w:ascii="Times New Roman" w:hAnsi="Times New Roman" w:cs="Times New Roman"/>
+        </w:rPr>
+        <w:t>. A, k vs. respiration, B, k vs. enzymes, C, k vs. microbial richness, D, k vs. microbial abundance.</w:t>
       </w:r>
     </w:p>
     <w:p>
@@ -1119,64 +1758,140 @@
           <w:b/>
           <w:bCs/>
         </w:rPr>
-        <w:t>Figure 4</w:t>
-      </w:r>
-      <w:r>
-        <w:rPr>
-          <w:rFonts w:ascii="Times New Roman" w:hAnsi="Times New Roman" w:cs="Times New Roman"/>
-        </w:rPr>
-        <w:t>. Schematic</w:t>
-      </w:r>
-    </w:p>
-    <w:p>
-      <w:pPr>
-        <w:rPr>
-          <w:rFonts w:ascii="Times New Roman" w:hAnsi="Times New Roman" w:cs="Times New Roman"/>
-        </w:rPr>
-      </w:pPr>
-    </w:p>
-    <w:p>
-      <w:pPr>
-        <w:rPr>
-          <w:rFonts w:ascii="Times New Roman" w:hAnsi="Times New Roman" w:cs="Times New Roman"/>
-        </w:rPr>
-      </w:pPr>
-    </w:p>
-    <w:p>
-      <w:pPr>
-        <w:rPr>
-          <w:rFonts w:ascii="Times New Roman" w:hAnsi="Times New Roman" w:cs="Times New Roman"/>
-        </w:rPr>
-      </w:pPr>
-    </w:p>
-    <w:p>
-      <w:pPr>
-        <w:rPr>
-          <w:rFonts w:ascii="Times New Roman" w:hAnsi="Times New Roman" w:cs="Times New Roman"/>
-        </w:rPr>
-      </w:pPr>
-    </w:p>
-    <w:p>
-      <w:pPr>
-        <w:rPr>
-          <w:rFonts w:ascii="Times New Roman" w:hAnsi="Times New Roman" w:cs="Times New Roman"/>
-        </w:rPr>
-      </w:pPr>
-    </w:p>
-    <w:p>
-      <w:pPr>
+        <w:t>Figure 3</w:t>
+      </w:r>
+      <w:r>
+        <w:rPr>
+          <w:rFonts w:ascii="Times New Roman" w:hAnsi="Times New Roman" w:cs="Times New Roman"/>
+        </w:rPr>
+        <w:t>. Microbial identity</w:t>
+      </w:r>
+      <w:r>
+        <w:rPr>
+          <w:rFonts w:ascii="Times New Roman" w:hAnsi="Times New Roman" w:cs="Times New Roman"/>
+        </w:rPr>
+        <w:t xml:space="preserve"> </w:t>
+      </w:r>
+      <w:proofErr w:type="gramStart"/>
+      <w:r>
+        <w:rPr>
+          <w:rFonts w:ascii="Times New Roman" w:hAnsi="Times New Roman" w:cs="Times New Roman"/>
+        </w:rPr>
+        <w:t>deep-dive</w:t>
+      </w:r>
+      <w:proofErr w:type="gramEnd"/>
+      <w:r>
+        <w:rPr>
+          <w:rFonts w:ascii="Times New Roman" w:hAnsi="Times New Roman" w:cs="Times New Roman"/>
+        </w:rPr>
+        <w:t xml:space="preserve">. A, </w:t>
+      </w:r>
+      <w:proofErr w:type="spellStart"/>
+      <w:r>
+        <w:rPr>
+          <w:rFonts w:ascii="Times New Roman" w:hAnsi="Times New Roman" w:cs="Times New Roman"/>
+        </w:rPr>
+        <w:t>nMDS</w:t>
+      </w:r>
+      <w:proofErr w:type="spellEnd"/>
+      <w:r>
+        <w:rPr>
+          <w:rFonts w:ascii="Times New Roman" w:hAnsi="Times New Roman" w:cs="Times New Roman"/>
+        </w:rPr>
+        <w:t xml:space="preserve">, B, </w:t>
+      </w:r>
+      <w:r>
+        <w:rPr>
+          <w:rFonts w:ascii="Times New Roman" w:hAnsi="Times New Roman" w:cs="Times New Roman"/>
+        </w:rPr>
+        <w:t xml:space="preserve">ASVs vs. time, C, ASVs vs. </w:t>
+      </w:r>
+      <w:proofErr w:type="spellStart"/>
+      <w:r>
+        <w:rPr>
+          <w:rFonts w:ascii="Times New Roman" w:hAnsi="Times New Roman" w:cs="Times New Roman"/>
+        </w:rPr>
+        <w:t>enyzmes</w:t>
+      </w:r>
+      <w:proofErr w:type="spellEnd"/>
+    </w:p>
+    <w:p>
+      <w:pPr>
+        <w:rPr>
+          <w:rFonts w:ascii="Times New Roman" w:hAnsi="Times New Roman" w:cs="Times New Roman"/>
+        </w:rPr>
+      </w:pPr>
+    </w:p>
+    <w:p>
+      <w:pPr>
+        <w:rPr>
+          <w:rFonts w:ascii="Times New Roman" w:hAnsi="Times New Roman" w:cs="Times New Roman"/>
+        </w:rPr>
+      </w:pPr>
+      <w:r>
         <w:rPr>
           <w:rFonts w:ascii="Times New Roman" w:hAnsi="Times New Roman" w:cs="Times New Roman"/>
           <w:b/>
           <w:bCs/>
         </w:rPr>
-      </w:pPr>
-      <w:r>
+        <w:t>Figure 4</w:t>
+      </w:r>
+      <w:r>
+        <w:rPr>
+          <w:rFonts w:ascii="Times New Roman" w:hAnsi="Times New Roman" w:cs="Times New Roman"/>
+        </w:rPr>
+        <w:t>. Schematic</w:t>
+      </w:r>
+    </w:p>
+    <w:p>
+      <w:pPr>
+        <w:rPr>
+          <w:rFonts w:ascii="Times New Roman" w:hAnsi="Times New Roman" w:cs="Times New Roman"/>
+        </w:rPr>
+      </w:pPr>
+    </w:p>
+    <w:p>
+      <w:pPr>
+        <w:rPr>
+          <w:rFonts w:ascii="Times New Roman" w:hAnsi="Times New Roman" w:cs="Times New Roman"/>
+        </w:rPr>
+      </w:pPr>
+    </w:p>
+    <w:p>
+      <w:pPr>
+        <w:rPr>
+          <w:rFonts w:ascii="Times New Roman" w:hAnsi="Times New Roman" w:cs="Times New Roman"/>
+        </w:rPr>
+      </w:pPr>
+    </w:p>
+    <w:p>
+      <w:pPr>
+        <w:rPr>
+          <w:rFonts w:ascii="Times New Roman" w:hAnsi="Times New Roman" w:cs="Times New Roman"/>
+        </w:rPr>
+      </w:pPr>
+    </w:p>
+    <w:p>
+      <w:pPr>
+        <w:rPr>
+          <w:rFonts w:ascii="Times New Roman" w:hAnsi="Times New Roman" w:cs="Times New Roman"/>
+        </w:rPr>
+      </w:pPr>
+    </w:p>
+    <w:p>
+      <w:pPr>
         <w:rPr>
           <w:rFonts w:ascii="Times New Roman" w:hAnsi="Times New Roman" w:cs="Times New Roman"/>
           <w:b/>
           <w:bCs/>
         </w:rPr>
+      </w:pPr>
+      <w:r>
+        <w:rPr>
+          <w:rFonts w:ascii="Times New Roman" w:hAnsi="Times New Roman" w:cs="Times New Roman"/>
+          <w:b/>
+          <w:bCs/>
+        </w:rPr>
         <w:t>Discussion</w:t>
       </w:r>
     </w:p>
@@ -1217,22 +1932,42 @@
           <w:i/>
           <w:iCs/>
         </w:rPr>
-        <w:t>Macrocystis pyrifera</w:t>
-      </w:r>
-      <w:r>
-        <w:rPr>
-          <w:rFonts w:ascii="Times New Roman" w:hAnsi="Times New Roman" w:cs="Times New Roman"/>
-        </w:rPr>
-        <w:t xml:space="preserve"> is quickly consumed by </w:t>
-      </w:r>
+        <w:t xml:space="preserve">Macrocystis </w:t>
+      </w:r>
+      <w:proofErr w:type="spellStart"/>
       <w:r>
         <w:rPr>
           <w:rFonts w:ascii="Times New Roman" w:hAnsi="Times New Roman" w:cs="Times New Roman"/>
           <w:i/>
           <w:iCs/>
         </w:rPr>
-        <w:t>Pseudomonas alginovora</w:t>
-      </w:r>
+        <w:t>pyrifera</w:t>
+      </w:r>
+      <w:proofErr w:type="spellEnd"/>
+      <w:r>
+        <w:rPr>
+          <w:rFonts w:ascii="Times New Roman" w:hAnsi="Times New Roman" w:cs="Times New Roman"/>
+        </w:rPr>
+        <w:t xml:space="preserve"> is quickly consumed by </w:t>
+      </w:r>
+      <w:r>
+        <w:rPr>
+          <w:rFonts w:ascii="Times New Roman" w:hAnsi="Times New Roman" w:cs="Times New Roman"/>
+          <w:i/>
+          <w:iCs/>
+        </w:rPr>
+        <w:t xml:space="preserve">Pseudomonas </w:t>
+      </w:r>
+      <w:proofErr w:type="spellStart"/>
+      <w:r>
+        <w:rPr>
+          <w:rFonts w:ascii="Times New Roman" w:hAnsi="Times New Roman" w:cs="Times New Roman"/>
+          <w:i/>
+          <w:iCs/>
+        </w:rPr>
+        <w:t>alginovora</w:t>
+      </w:r>
+      <w:proofErr w:type="spellEnd"/>
       <w:r>
         <w:rPr>
           <w:rFonts w:ascii="Times New Roman" w:hAnsi="Times New Roman" w:cs="Times New Roman"/>
@@ -1249,7 +1984,14 @@
         <w:rPr>
           <w:rFonts w:ascii="Times New Roman" w:hAnsi="Times New Roman" w:cs="Times New Roman"/>
         </w:rPr>
-        <w:t>{Küpper et al., 2001 #1206}</w:t>
+        <w:t>{Küpper et al., 2001 #1206</w:t>
+      </w:r>
+      <w:proofErr w:type="gramStart"/>
+      <w:r>
+        <w:rPr>
+          <w:rFonts w:ascii="Times New Roman" w:hAnsi="Times New Roman" w:cs="Times New Roman"/>
+        </w:rPr>
+        <w:t>}</w:t>
       </w:r>
       <w:r>
         <w:rPr>
@@ -1261,13 +2003,97 @@
         <w:rPr>
           <w:rFonts w:ascii="Times New Roman" w:hAnsi="Times New Roman" w:cs="Times New Roman"/>
         </w:rPr>
-        <w:t>{Twigg et al., 2020 #64462}{Saha et al., 2014 #22477}{Saha and Weinberger, 2019 #91511}{Weinberger, 2007 #87875}{Weinberger et al., 1999 #3836}</w:t>
-      </w:r>
-      <w:r>
-        <w:rPr>
-          <w:rFonts w:ascii="Times New Roman" w:hAnsi="Times New Roman" w:cs="Times New Roman"/>
-        </w:rPr>
-        <w:t>{Küpper et al., 2006 #33417}</w:t>
+        <w:t>{</w:t>
+      </w:r>
+      <w:proofErr w:type="gramEnd"/>
+      <w:r>
+        <w:rPr>
+          <w:rFonts w:ascii="Times New Roman" w:hAnsi="Times New Roman" w:cs="Times New Roman"/>
+        </w:rPr>
+        <w:t>Twigg et al., 2020 #</w:t>
+      </w:r>
+      <w:proofErr w:type="gramStart"/>
+      <w:r>
+        <w:rPr>
+          <w:rFonts w:ascii="Times New Roman" w:hAnsi="Times New Roman" w:cs="Times New Roman"/>
+        </w:rPr>
+        <w:t>64462}{</w:t>
+      </w:r>
+      <w:proofErr w:type="gramEnd"/>
+      <w:r>
+        <w:rPr>
+          <w:rFonts w:ascii="Times New Roman" w:hAnsi="Times New Roman" w:cs="Times New Roman"/>
+        </w:rPr>
+        <w:t>Saha et al., 2014 #</w:t>
+      </w:r>
+      <w:proofErr w:type="gramStart"/>
+      <w:r>
+        <w:rPr>
+          <w:rFonts w:ascii="Times New Roman" w:hAnsi="Times New Roman" w:cs="Times New Roman"/>
+        </w:rPr>
+        <w:t>22477}{</w:t>
+      </w:r>
+      <w:proofErr w:type="gramEnd"/>
+      <w:r>
+        <w:rPr>
+          <w:rFonts w:ascii="Times New Roman" w:hAnsi="Times New Roman" w:cs="Times New Roman"/>
+        </w:rPr>
+        <w:t xml:space="preserve">Saha and </w:t>
+      </w:r>
+      <w:r>
+        <w:rPr>
+          <w:rFonts w:ascii="Times New Roman" w:hAnsi="Times New Roman" w:cs="Times New Roman"/>
+        </w:rPr>
+        <w:lastRenderedPageBreak/>
+        <w:t>Weinberger, 2019 #</w:t>
+      </w:r>
+      <w:proofErr w:type="gramStart"/>
+      <w:r>
+        <w:rPr>
+          <w:rFonts w:ascii="Times New Roman" w:hAnsi="Times New Roman" w:cs="Times New Roman"/>
+        </w:rPr>
+        <w:t>91511}{</w:t>
+      </w:r>
+      <w:proofErr w:type="gramEnd"/>
+      <w:r>
+        <w:rPr>
+          <w:rFonts w:ascii="Times New Roman" w:hAnsi="Times New Roman" w:cs="Times New Roman"/>
+        </w:rPr>
+        <w:t>Weinberger, 2007 #</w:t>
+      </w:r>
+      <w:proofErr w:type="gramStart"/>
+      <w:r>
+        <w:rPr>
+          <w:rFonts w:ascii="Times New Roman" w:hAnsi="Times New Roman" w:cs="Times New Roman"/>
+        </w:rPr>
+        <w:t>87875}{</w:t>
+      </w:r>
+      <w:proofErr w:type="gramEnd"/>
+      <w:r>
+        <w:rPr>
+          <w:rFonts w:ascii="Times New Roman" w:hAnsi="Times New Roman" w:cs="Times New Roman"/>
+        </w:rPr>
+        <w:t>Weinberger et al., 1999 #</w:t>
+      </w:r>
+      <w:proofErr w:type="gramStart"/>
+      <w:r>
+        <w:rPr>
+          <w:rFonts w:ascii="Times New Roman" w:hAnsi="Times New Roman" w:cs="Times New Roman"/>
+        </w:rPr>
+        <w:t>3836}</w:t>
+      </w:r>
+      <w:r>
+        <w:rPr>
+          <w:rFonts w:ascii="Times New Roman" w:hAnsi="Times New Roman" w:cs="Times New Roman"/>
+        </w:rPr>
+        <w:t>{</w:t>
+      </w:r>
+      <w:proofErr w:type="gramEnd"/>
+      <w:r>
+        <w:rPr>
+          <w:rFonts w:ascii="Times New Roman" w:hAnsi="Times New Roman" w:cs="Times New Roman"/>
+        </w:rPr>
+        <w:t>Küpper et al., 2006 #33417}</w:t>
       </w:r>
     </w:p>
     <w:p>
@@ -2245,6 +3071,19 @@
       <w:shd w:val="clear" w:color="auto" w:fill="E1DFDD"/>
     </w:rPr>
   </w:style>
+  <w:style w:type="paragraph" w:customStyle="1" w:styleId="p1">
+    <w:name w:val="p1"/>
+    <w:basedOn w:val="Normal"/>
+    <w:rsid w:val="00283BE0"/>
+    <w:rPr>
+      <w:rFonts w:ascii="Helvetica" w:eastAsia="Times New Roman" w:hAnsi="Helvetica" w:cs="Times New Roman"/>
+      <w:color w:val="000000"/>
+      <w:kern w:val="0"/>
+      <w:sz w:val="14"/>
+      <w:szCs w:val="14"/>
+      <w:lang w:eastAsia="en-GB"/>
+    </w:rPr>
+  </w:style>
 </w:styles>
 </file>
 

</xml_diff>